<commit_message>
Optimize Reputation-Aware logic: Resolve Render.com false positive and harden payload hosting abuse detection (99.52% TPR)
</commit_message>
<xml_diff>
--- a/SentinURL.docx
+++ b/SentinURL.docx
@@ -740,7 +740,7 @@
           <w:r>
             <w:fldChar w:fldCharType="separate"/>
           </w:r>
-          <w:hyperlink w:anchor="_Toc226402539" w:history="1">
+          <w:hyperlink w:anchor="_Toc226733462" w:history="1">
             <w:r>
               <w:rPr>
                 <w:rStyle w:val="Hyperlink"/>
@@ -769,7 +769,7 @@
                 <w:noProof/>
                 <w:webHidden/>
               </w:rPr>
-              <w:instrText xml:space="preserve"> PAGEREF _Toc226402539 \h </w:instrText>
+              <w:instrText xml:space="preserve"> PAGEREF _Toc226733462 \h </w:instrText>
             </w:r>
             <w:r>
               <w:rPr>
@@ -813,7 +813,7 @@
               <w14:ligatures w14:val="standardContextual"/>
             </w:rPr>
           </w:pPr>
-          <w:hyperlink w:anchor="_Toc226402540" w:history="1">
+          <w:hyperlink w:anchor="_Toc226733463" w:history="1">
             <w:r>
               <w:rPr>
                 <w:rStyle w:val="Hyperlink"/>
@@ -842,7 +842,7 @@
                 <w:noProof/>
                 <w:webHidden/>
               </w:rPr>
-              <w:instrText xml:space="preserve"> PAGEREF _Toc226402540 \h </w:instrText>
+              <w:instrText xml:space="preserve"> PAGEREF _Toc226733463 \h </w:instrText>
             </w:r>
             <w:r>
               <w:rPr>
@@ -886,7 +886,7 @@
               <w14:ligatures w14:val="standardContextual"/>
             </w:rPr>
           </w:pPr>
-          <w:hyperlink w:anchor="_Toc226402541" w:history="1">
+          <w:hyperlink w:anchor="_Toc226733464" w:history="1">
             <w:r>
               <w:rPr>
                 <w:rStyle w:val="Hyperlink"/>
@@ -915,7 +915,7 @@
                 <w:noProof/>
                 <w:webHidden/>
               </w:rPr>
-              <w:instrText xml:space="preserve"> PAGEREF _Toc226402541 \h </w:instrText>
+              <w:instrText xml:space="preserve"> PAGEREF _Toc226733464 \h </w:instrText>
             </w:r>
             <w:r>
               <w:rPr>
@@ -959,7 +959,7 @@
               <w14:ligatures w14:val="standardContextual"/>
             </w:rPr>
           </w:pPr>
-          <w:hyperlink w:anchor="_Toc226402542" w:history="1">
+          <w:hyperlink w:anchor="_Toc226733465" w:history="1">
             <w:r>
               <w:rPr>
                 <w:rStyle w:val="Hyperlink"/>
@@ -988,7 +988,7 @@
                 <w:noProof/>
                 <w:webHidden/>
               </w:rPr>
-              <w:instrText xml:space="preserve"> PAGEREF _Toc226402542 \h </w:instrText>
+              <w:instrText xml:space="preserve"> PAGEREF _Toc226733465 \h </w:instrText>
             </w:r>
             <w:r>
               <w:rPr>
@@ -1032,7 +1032,7 @@
               <w14:ligatures w14:val="standardContextual"/>
             </w:rPr>
           </w:pPr>
-          <w:hyperlink w:anchor="_Toc226402543" w:history="1">
+          <w:hyperlink w:anchor="_Toc226733466" w:history="1">
             <w:r>
               <w:rPr>
                 <w:rStyle w:val="Hyperlink"/>
@@ -1061,7 +1061,7 @@
                 <w:noProof/>
                 <w:webHidden/>
               </w:rPr>
-              <w:instrText xml:space="preserve"> PAGEREF _Toc226402543 \h </w:instrText>
+              <w:instrText xml:space="preserve"> PAGEREF _Toc226733466 \h </w:instrText>
             </w:r>
             <w:r>
               <w:rPr>
@@ -1105,7 +1105,7 @@
               <w14:ligatures w14:val="standardContextual"/>
             </w:rPr>
           </w:pPr>
-          <w:hyperlink w:anchor="_Toc226402544" w:history="1">
+          <w:hyperlink w:anchor="_Toc226733467" w:history="1">
             <w:r>
               <w:rPr>
                 <w:rStyle w:val="Hyperlink"/>
@@ -1134,7 +1134,7 @@
                 <w:noProof/>
                 <w:webHidden/>
               </w:rPr>
-              <w:instrText xml:space="preserve"> PAGEREF _Toc226402544 \h </w:instrText>
+              <w:instrText xml:space="preserve"> PAGEREF _Toc226733467 \h </w:instrText>
             </w:r>
             <w:r>
               <w:rPr>
@@ -1178,7 +1178,7 @@
               <w14:ligatures w14:val="standardContextual"/>
             </w:rPr>
           </w:pPr>
-          <w:hyperlink w:anchor="_Toc226402545" w:history="1">
+          <w:hyperlink w:anchor="_Toc226733468" w:history="1">
             <w:r>
               <w:rPr>
                 <w:rStyle w:val="Hyperlink"/>
@@ -1207,7 +1207,7 @@
                 <w:noProof/>
                 <w:webHidden/>
               </w:rPr>
-              <w:instrText xml:space="preserve"> PAGEREF _Toc226402545 \h </w:instrText>
+              <w:instrText xml:space="preserve"> PAGEREF _Toc226733468 \h </w:instrText>
             </w:r>
             <w:r>
               <w:rPr>
@@ -1251,7 +1251,7 @@
               <w14:ligatures w14:val="standardContextual"/>
             </w:rPr>
           </w:pPr>
-          <w:hyperlink w:anchor="_Toc226402546" w:history="1">
+          <w:hyperlink w:anchor="_Toc226733469" w:history="1">
             <w:r>
               <w:rPr>
                 <w:rStyle w:val="Hyperlink"/>
@@ -1280,7 +1280,7 @@
                 <w:noProof/>
                 <w:webHidden/>
               </w:rPr>
-              <w:instrText xml:space="preserve"> PAGEREF _Toc226402546 \h </w:instrText>
+              <w:instrText xml:space="preserve"> PAGEREF _Toc226733469 \h </w:instrText>
             </w:r>
             <w:r>
               <w:rPr>
@@ -1324,7 +1324,7 @@
               <w14:ligatures w14:val="standardContextual"/>
             </w:rPr>
           </w:pPr>
-          <w:hyperlink w:anchor="_Toc226402547" w:history="1">
+          <w:hyperlink w:anchor="_Toc226733470" w:history="1">
             <w:r>
               <w:rPr>
                 <w:rStyle w:val="Hyperlink"/>
@@ -1353,7 +1353,7 @@
                 <w:noProof/>
                 <w:webHidden/>
               </w:rPr>
-              <w:instrText xml:space="preserve"> PAGEREF _Toc226402547 \h </w:instrText>
+              <w:instrText xml:space="preserve"> PAGEREF _Toc226733470 \h </w:instrText>
             </w:r>
             <w:r>
               <w:rPr>
@@ -1397,7 +1397,7 @@
               <w14:ligatures w14:val="standardContextual"/>
             </w:rPr>
           </w:pPr>
-          <w:hyperlink w:anchor="_Toc226402548" w:history="1">
+          <w:hyperlink w:anchor="_Toc226733471" w:history="1">
             <w:r>
               <w:rPr>
                 <w:rStyle w:val="Hyperlink"/>
@@ -1426,7 +1426,7 @@
                 <w:noProof/>
                 <w:webHidden/>
               </w:rPr>
-              <w:instrText xml:space="preserve"> PAGEREF _Toc226402548 \h </w:instrText>
+              <w:instrText xml:space="preserve"> PAGEREF _Toc226733471 \h </w:instrText>
             </w:r>
             <w:r>
               <w:rPr>
@@ -1470,7 +1470,7 @@
               <w14:ligatures w14:val="standardContextual"/>
             </w:rPr>
           </w:pPr>
-          <w:hyperlink w:anchor="_Toc226402549" w:history="1">
+          <w:hyperlink w:anchor="_Toc226733472" w:history="1">
             <w:r>
               <w:rPr>
                 <w:rStyle w:val="Hyperlink"/>
@@ -1499,7 +1499,7 @@
                 <w:noProof/>
                 <w:webHidden/>
               </w:rPr>
-              <w:instrText xml:space="preserve"> PAGEREF _Toc226402549 \h </w:instrText>
+              <w:instrText xml:space="preserve"> PAGEREF _Toc226733472 \h </w:instrText>
             </w:r>
             <w:r>
               <w:rPr>
@@ -1543,7 +1543,7 @@
               <w14:ligatures w14:val="standardContextual"/>
             </w:rPr>
           </w:pPr>
-          <w:hyperlink w:anchor="_Toc226402550" w:history="1">
+          <w:hyperlink w:anchor="_Toc226733473" w:history="1">
             <w:r>
               <w:rPr>
                 <w:rStyle w:val="Hyperlink"/>
@@ -1551,7 +1551,7 @@
                 <w:bCs/>
                 <w:noProof/>
               </w:rPr>
-              <w:t>Results</w:t>
+              <w:t>Core Algorithms and Code Architecture</w:t>
             </w:r>
             <w:r>
               <w:rPr>
@@ -1572,7 +1572,7 @@
                 <w:noProof/>
                 <w:webHidden/>
               </w:rPr>
-              <w:instrText xml:space="preserve"> PAGEREF _Toc226402550 \h </w:instrText>
+              <w:instrText xml:space="preserve"> PAGEREF _Toc226733473 \h </w:instrText>
             </w:r>
             <w:r>
               <w:rPr>
@@ -1616,7 +1616,7 @@
               <w14:ligatures w14:val="standardContextual"/>
             </w:rPr>
           </w:pPr>
-          <w:hyperlink w:anchor="_Toc226402551" w:history="1">
+          <w:hyperlink w:anchor="_Toc226733474" w:history="1">
             <w:r>
               <w:rPr>
                 <w:rStyle w:val="Hyperlink"/>
@@ -1624,7 +1624,7 @@
                 <w:bCs/>
                 <w:noProof/>
               </w:rPr>
-              <w:t>Appendix: Core Algorithms and Code Architecture</w:t>
+              <w:t>Results</w:t>
             </w:r>
             <w:r>
               <w:rPr>
@@ -1645,7 +1645,7 @@
                 <w:noProof/>
                 <w:webHidden/>
               </w:rPr>
-              <w:instrText xml:space="preserve"> PAGEREF _Toc226402551 \h </w:instrText>
+              <w:instrText xml:space="preserve"> PAGEREF _Toc226733474 \h </w:instrText>
             </w:r>
             <w:r>
               <w:rPr>
@@ -1665,7 +1665,7 @@
                 <w:noProof/>
                 <w:webHidden/>
               </w:rPr>
-              <w:t>48</w:t>
+              <w:t>59</w:t>
             </w:r>
             <w:r>
               <w:rPr>
@@ -1689,78 +1689,7 @@
               <w14:ligatures w14:val="standardContextual"/>
             </w:rPr>
           </w:pPr>
-          <w:hyperlink w:anchor="_Toc226402552" w:history="1">
-            <w:r>
-              <w:rPr>
-                <w:rStyle w:val="Hyperlink"/>
-                <w:noProof/>
-              </w:rPr>
-              <w:t>Appendix: Core Algorithms and Code Architecture".</w:t>
-            </w:r>
-            <w:r>
-              <w:rPr>
-                <w:noProof/>
-                <w:webHidden/>
-              </w:rPr>
-              <w:tab/>
-            </w:r>
-            <w:r>
-              <w:rPr>
-                <w:noProof/>
-                <w:webHidden/>
-              </w:rPr>
-              <w:fldChar w:fldCharType="begin"/>
-            </w:r>
-            <w:r>
-              <w:rPr>
-                <w:noProof/>
-                <w:webHidden/>
-              </w:rPr>
-              <w:instrText xml:space="preserve"> PAGEREF _Toc226402552 \h </w:instrText>
-            </w:r>
-            <w:r>
-              <w:rPr>
-                <w:noProof/>
-                <w:webHidden/>
-              </w:rPr>
-            </w:r>
-            <w:r>
-              <w:rPr>
-                <w:noProof/>
-                <w:webHidden/>
-              </w:rPr>
-              <w:fldChar w:fldCharType="separate"/>
-            </w:r>
-            <w:r>
-              <w:rPr>
-                <w:noProof/>
-                <w:webHidden/>
-              </w:rPr>
-              <w:t>49</w:t>
-            </w:r>
-            <w:r>
-              <w:rPr>
-                <w:noProof/>
-                <w:webHidden/>
-              </w:rPr>
-              <w:fldChar w:fldCharType="end"/>
-            </w:r>
-          </w:hyperlink>
-        </w:p>
-        <w:p>
-          <w:pPr>
-            <w:pStyle w:val="TOC1"/>
-            <w:tabs>
-              <w:tab w:val="right" w:leader="dot" w:pos="9350"/>
-            </w:tabs>
-            <w:rPr>
-              <w:noProof/>
-              <w:kern w:val="2"/>
-              <w:lang w:eastAsia="en-US"/>
-              <w14:ligatures w14:val="standardContextual"/>
-            </w:rPr>
-          </w:pPr>
-          <w:hyperlink w:anchor="_Toc226402553" w:history="1">
+          <w:hyperlink w:anchor="_Toc226733475" w:history="1">
             <w:r>
               <w:rPr>
                 <w:rStyle w:val="Hyperlink"/>
@@ -1789,7 +1718,7 @@
                 <w:noProof/>
                 <w:webHidden/>
               </w:rPr>
-              <w:instrText xml:space="preserve"> PAGEREF _Toc226402553 \h </w:instrText>
+              <w:instrText xml:space="preserve"> PAGEREF _Toc226733475 \h </w:instrText>
             </w:r>
             <w:r>
               <w:rPr>
@@ -1809,7 +1738,7 @@
                 <w:noProof/>
                 <w:webHidden/>
               </w:rPr>
-              <w:t>49</w:t>
+              <w:t>60</w:t>
             </w:r>
             <w:r>
               <w:rPr>
@@ -1870,7 +1799,7 @@
       <w:bookmarkStart w:id="1" w:name="_Toc1119813556"/>
       <w:bookmarkStart w:id="2" w:name="_Toc140429635"/>
       <w:bookmarkStart w:id="3" w:name="_Toc828735313"/>
-      <w:bookmarkStart w:id="4" w:name="_Toc226402539"/>
+      <w:bookmarkStart w:id="4" w:name="_Toc226733462"/>
       <w:r>
         <w:rPr>
           <w:b/>
@@ -2380,7 +2309,7 @@
       <w:bookmarkStart w:id="8" w:name="_Toc572627574"/>
       <w:bookmarkStart w:id="9" w:name="_Toc1332436245"/>
       <w:bookmarkStart w:id="10" w:name="_Toc1457075537"/>
-      <w:bookmarkStart w:id="11" w:name="_Toc226402540"/>
+      <w:bookmarkStart w:id="11" w:name="_Toc226733463"/>
       <w:r>
         <w:rPr>
           <w:b/>
@@ -2598,7 +2527,7 @@
       <w:bookmarkStart w:id="16" w:name="_Toc392527840"/>
       <w:bookmarkStart w:id="17" w:name="_Toc978943560"/>
       <w:bookmarkStart w:id="18" w:name="_Toc496626820"/>
-      <w:bookmarkStart w:id="19" w:name="_Toc226402541"/>
+      <w:bookmarkStart w:id="19" w:name="_Toc226733464"/>
       <w:r>
         <w:rPr>
           <w:b/>
@@ -3182,7 +3111,7 @@
       <w:bookmarkStart w:id="20" w:name="_Toc246600772"/>
       <w:bookmarkStart w:id="21" w:name="_Toc1708488655"/>
       <w:bookmarkStart w:id="22" w:name="_Toc1914070058"/>
-      <w:bookmarkStart w:id="23" w:name="_Toc226402542"/>
+      <w:bookmarkStart w:id="23" w:name="_Toc226733465"/>
       <w:r>
         <w:rPr>
           <w:b/>
@@ -3848,7 +3777,7 @@
       <w:bookmarkStart w:id="25" w:name="_Toc1161912007"/>
       <w:bookmarkStart w:id="26" w:name="_Toc1530182636"/>
       <w:bookmarkStart w:id="27" w:name="_Toc1016639301"/>
-      <w:bookmarkStart w:id="28" w:name="_Toc226402543"/>
+      <w:bookmarkStart w:id="28" w:name="_Toc226733466"/>
       <w:r>
         <w:rPr>
           <w:b/>
@@ -4108,7 +4037,7 @@
       <w:bookmarkStart w:id="29" w:name="_Toc1065198478"/>
       <w:bookmarkStart w:id="30" w:name="_Toc1206462646"/>
       <w:bookmarkStart w:id="31" w:name="_Toc1705698683"/>
-      <w:bookmarkStart w:id="32" w:name="_Toc226402544"/>
+      <w:bookmarkStart w:id="32" w:name="_Toc226733467"/>
       <w:r>
         <w:rPr>
           <w:b/>
@@ -5973,7 +5902,7 @@
       <w:bookmarkStart w:id="33" w:name="_Toc40901276"/>
       <w:bookmarkStart w:id="34" w:name="_Toc1381658425"/>
       <w:bookmarkStart w:id="35" w:name="_Toc1383938656"/>
-      <w:bookmarkStart w:id="36" w:name="_Toc226402545"/>
+      <w:bookmarkStart w:id="36" w:name="_Toc226733468"/>
       <w:r>
         <w:rPr>
           <w:b/>
@@ -7697,7 +7626,7 @@
           <w:bCs/>
         </w:rPr>
       </w:pPr>
-      <w:bookmarkStart w:id="40" w:name="_Toc226402546"/>
+      <w:bookmarkStart w:id="40" w:name="_Toc226733469"/>
       <w:r>
         <w:rPr>
           <w:b/>
@@ -9478,7 +9407,7 @@
       <w:bookmarkStart w:id="41" w:name="_Toc643173057"/>
       <w:bookmarkStart w:id="42" w:name="_Toc2070421709"/>
       <w:bookmarkStart w:id="43" w:name="_Toc1789410505"/>
-      <w:bookmarkStart w:id="44" w:name="_Toc226402547"/>
+      <w:bookmarkStart w:id="44" w:name="_Toc226733470"/>
       <w:r>
         <w:rPr>
           <w:b/>
@@ -10646,7 +10575,7 @@
       <w:bookmarkStart w:id="45" w:name="_Toc825359928"/>
       <w:bookmarkStart w:id="46" w:name="_Toc1527080409"/>
       <w:bookmarkStart w:id="47" w:name="_Toc1477932741"/>
-      <w:bookmarkStart w:id="48" w:name="_Toc226402548"/>
+      <w:bookmarkStart w:id="48" w:name="_Toc226733471"/>
       <w:r>
         <w:rPr>
           <w:b/>
@@ -11626,7 +11555,7 @@
       <w:bookmarkStart w:id="49" w:name="_Toc1400887560"/>
       <w:bookmarkStart w:id="50" w:name="_Toc1927824981"/>
       <w:bookmarkStart w:id="51" w:name="_Toc1136780561"/>
-      <w:bookmarkStart w:id="52" w:name="_Toc226402549"/>
+      <w:bookmarkStart w:id="52" w:name="_Toc226733472"/>
       <w:r>
         <w:rPr>
           <w:b/>
@@ -13473,7 +13402,6 @@
       <w:bookmarkStart w:id="60" w:name="_Toc543713899"/>
       <w:bookmarkStart w:id="61" w:name="_Toc120377232"/>
       <w:bookmarkStart w:id="62" w:name="_Toc492182197"/>
-      <w:bookmarkStart w:id="63" w:name="_Toc226402550"/>
       <w:r>
         <w:rPr>
           <w:b/>
@@ -13481,7 +13409,7 @@
         </w:rPr>
         <w:br w:type="page"/>
       </w:r>
-      <w:bookmarkStart w:id="64" w:name="_Toc226402551"/>
+      <w:bookmarkStart w:id="63" w:name="_Toc226733473"/>
       <w:r>
         <w:rPr>
           <w:b/>
@@ -13490,7 +13418,7 @@
         <w:lastRenderedPageBreak/>
         <w:t>Core Algorithms and Code Architecture</w:t>
       </w:r>
-      <w:bookmarkEnd w:id="64"/>
+      <w:bookmarkEnd w:id="63"/>
     </w:p>
     <w:p>
       <w:pPr>
@@ -13820,35 +13748,7 @@
         <w:rPr>
           <w:rFonts w:eastAsiaTheme="majorEastAsia"/>
         </w:rPr>
-        <w:t xml:space="preserve">("PORT", 8345) call is a cloud deployment best practice. When Render.com provisions a container, it dynamically assigns a port number through an </w:t>
-      </w:r>
-      <w:proofErr w:type="gramStart"/>
-      <w:r>
-        <w:rPr>
-          <w:rFonts w:eastAsiaTheme="majorEastAsia"/>
-        </w:rPr>
-        <w:t>environment</w:t>
-      </w:r>
-      <w:proofErr w:type="gramEnd"/>
-      <w:r>
-        <w:rPr>
-          <w:rFonts w:eastAsiaTheme="majorEastAsia"/>
-        </w:rPr>
-        <w:t xml:space="preserve"> variable. By reading the port from the environment rather than hardcoding it, the server remains fully portable — it runs on port 8345 locally during </w:t>
-      </w:r>
-      <w:proofErr w:type="gramStart"/>
-      <w:r>
-        <w:rPr>
-          <w:rFonts w:eastAsiaTheme="majorEastAsia"/>
-        </w:rPr>
-        <w:t>development, and</w:t>
-      </w:r>
-      <w:proofErr w:type="gramEnd"/>
-      <w:r>
-        <w:rPr>
-          <w:rFonts w:eastAsiaTheme="majorEastAsia"/>
-        </w:rPr>
-        <w:t xml:space="preserve"> automatically adapts to whatever port the cloud infrastructure assigns in production without any code changes</w:t>
+        <w:t>("PORT", 8345) call is a cloud deployment best practice. When Render.com provisions a container, it dynamically assigns a port number through an environment variable. By reading the port from the environment rather than hardcoding it, the server remains fully portable — it runs on port 8345 locally during development, and automatically adapts to whatever port the cloud infrastructure assigns in production without any code changes</w:t>
       </w:r>
       <w:r>
         <w:rPr>
@@ -14532,15 +14432,7 @@
         <w:jc w:val="both"/>
       </w:pPr>
       <w:r>
-        <w:t xml:space="preserve">A rapidly evolving threat category known as "Quishing" (QR-code Phishing) exploits a blind spot in conventional URL scanning: the malicious payload is not transmitted as a text </w:t>
-      </w:r>
-      <w:proofErr w:type="gramStart"/>
-      <w:r>
-        <w:t>hyperlink, but</w:t>
-      </w:r>
-      <w:proofErr w:type="gramEnd"/>
-      <w:r>
-        <w:t xml:space="preserve"> is encoded as an optical matrix pattern — a QR code — embedded in a physical image. Standard URL scanners are completely blind to this attack vector because they process strings, not images.</w:t>
+        <w:t>A rapidly evolving threat category known as "Quishing" (QR-code Phishing) exploits a blind spot in conventional URL scanning: the malicious payload is not transmitted as a text hyperlink, but is encoded as an optical matrix pattern — a QR code — embedded in a physical image. Standard URL scanners are completely blind to this attack vector because they process strings, not images.</w:t>
       </w:r>
     </w:p>
     <w:p>
@@ -15344,15 +15236,7 @@
         <w:t>path component</w:t>
       </w:r>
       <w:r>
-        <w:t xml:space="preserve"> of the URL. For the </w:t>
-      </w:r>
-      <w:proofErr w:type="gramStart"/>
-      <w:r>
-        <w:t>URL https://xyz.com/kzpqvrmx8f3j/payload, this gives us /kzpqvrmx8f3j/payload.</w:t>
-      </w:r>
-      <w:proofErr w:type="gramEnd"/>
-      <w:r>
-        <w:t xml:space="preserve"> We focus exclusively on the path rather than the hostname because domain entropy is analyzed separately in the feature engineering pipeline.</w:t>
+        <w:t> of the URL. For the URL https://xyz.com/kzpqvrmx8f3j/payload, this gives us /kzpqvrmx8f3j/payload. We focus exclusively on the path rather than the hostname because domain entropy is analyzed separately in the feature engineering pipeline.</w:t>
       </w:r>
     </w:p>
     <w:p>
@@ -15628,6 +15512,7 @@
           <w:bCs/>
         </w:rPr>
       </w:pPr>
+      <w:bookmarkStart w:id="64" w:name="_Toc226733474"/>
       <w:r>
         <w:rPr>
           <w:b/>
@@ -15639,7 +15524,7 @@
       <w:bookmarkEnd w:id="60"/>
       <w:bookmarkEnd w:id="61"/>
       <w:bookmarkEnd w:id="62"/>
-      <w:bookmarkEnd w:id="63"/>
+      <w:bookmarkEnd w:id="64"/>
     </w:p>
     <w:p>
       <w:pPr>
@@ -15842,7 +15727,7 @@
       <w:bookmarkStart w:id="65" w:name="_Toc700387597"/>
       <w:bookmarkStart w:id="66" w:name="_Toc540555467"/>
       <w:bookmarkStart w:id="67" w:name="_Toc977035809"/>
-      <w:bookmarkStart w:id="68" w:name="_Toc226402553"/>
+      <w:bookmarkStart w:id="68" w:name="_Toc226733475"/>
       <w:r>
         <w:rPr>
           <w:b/>
@@ -23557,6 +23442,7 @@
   <w:style w:type="character" w:default="1" w:styleId="DefaultParagraphFont">
     <w:name w:val="Default Paragraph Font"/>
     <w:uiPriority w:val="1"/>
+    <w:semiHidden/>
     <w:unhideWhenUsed/>
   </w:style>
   <w:style w:type="table" w:default="1" w:styleId="TableNormal">
@@ -24317,6 +24203,27 @@
 </file>
 
 <file path=customXml/item1.xml><?xml version="1.0" encoding="utf-8"?>
+<p:properties xmlns:p="http://schemas.microsoft.com/office/2006/metadata/properties" xmlns:xsi="http://www.w3.org/2001/XMLSchema-instance" xmlns:pc="http://schemas.microsoft.com/office/infopath/2007/PartnerControls">
+  <documentManagement>
+    <ReferenceId xmlns="2f41cacf-ba40-4e80-92c4-0d83ba37ea51" xsi:nil="true"/>
+  </documentManagement>
+</p:properties>
+</file>
+
+<file path=customXml/item2.xml><?xml version="1.0" encoding="utf-8"?>
+<b:Sources xmlns:b="http://schemas.openxmlformats.org/officeDocument/2006/bibliography" xmlns="http://schemas.openxmlformats.org/officeDocument/2006/bibliography" SelectedStyle="\APASixthEditionOfficeOnline.xsl" StyleName="APA" Version="6"/>
+</file>
+
+<file path=customXml/item3.xml><?xml version="1.0" encoding="utf-8"?>
+<?mso-contentType ?>
+<FormTemplates xmlns="http://schemas.microsoft.com/sharepoint/v3/contenttype/forms">
+  <Display>DocumentLibraryForm</Display>
+  <Edit>DocumentLibraryForm</Edit>
+  <New>DocumentLibraryForm</New>
+</FormTemplates>
+</file>
+
+<file path=customXml/item4.xml><?xml version="1.0" encoding="utf-8"?>
 <ct:contentTypeSchema xmlns:ct="http://schemas.microsoft.com/office/2006/metadata/contentType" xmlns:ma="http://schemas.microsoft.com/office/2006/metadata/properties/metaAttributes" ct:_="" ma:_="" ma:contentTypeName="Document" ma:contentTypeID="0x010100C8027AB9FCF2A048BAA2B3190D159F70" ma:contentTypeVersion="4" ma:contentTypeDescription="Create a new document." ma:contentTypeScope="" ma:versionID="a3bbf791e9e695821cf694cadceaf317">
   <xsd:schema xmlns:xsd="http://www.w3.org/2001/XMLSchema" xmlns:xs="http://www.w3.org/2001/XMLSchema" xmlns:p="http://schemas.microsoft.com/office/2006/metadata/properties" xmlns:ns2="2f41cacf-ba40-4e80-92c4-0d83ba37ea51" targetNamespace="http://schemas.microsoft.com/office/2006/metadata/properties" ma:root="true" ma:fieldsID="fce7e238dc3040832873a454b433a91e" ns2:_="">
     <xsd:import namespace="2f41cacf-ba40-4e80-92c4-0d83ba37ea51"/>
@@ -24460,28 +24367,33 @@
 </ct:contentTypeSchema>
 </file>
 
-<file path=customXml/item2.xml><?xml version="1.0" encoding="utf-8"?>
-<p:properties xmlns:p="http://schemas.microsoft.com/office/2006/metadata/properties" xmlns:xsi="http://www.w3.org/2001/XMLSchema-instance" xmlns:pc="http://schemas.microsoft.com/office/infopath/2007/PartnerControls">
-  <documentManagement>
-    <ReferenceId xmlns="2f41cacf-ba40-4e80-92c4-0d83ba37ea51" xsi:nil="true"/>
-  </documentManagement>
-</p:properties>
+<file path=customXml/itemProps1.xml><?xml version="1.0" encoding="utf-8"?>
+<ds:datastoreItem xmlns:ds="http://schemas.openxmlformats.org/officeDocument/2006/customXml" ds:itemID="{458F831A-0A64-4E61-9EE3-6D1D2F9B0B8D}">
+  <ds:schemaRefs>
+    <ds:schemaRef ds:uri="http://schemas.microsoft.com/office/2006/metadata/properties"/>
+    <ds:schemaRef ds:uri="http://schemas.microsoft.com/office/infopath/2007/PartnerControls"/>
+    <ds:schemaRef ds:uri="2f41cacf-ba40-4e80-92c4-0d83ba37ea51"/>
+  </ds:schemaRefs>
+</ds:datastoreItem>
 </file>
 
-<file path=customXml/item3.xml><?xml version="1.0" encoding="utf-8"?>
-<?mso-contentType ?>
-<FormTemplates xmlns="http://schemas.microsoft.com/sharepoint/v3/contenttype/forms">
-  <Display>DocumentLibraryForm</Display>
-  <Edit>DocumentLibraryForm</Edit>
-  <New>DocumentLibraryForm</New>
-</FormTemplates>
+<file path=customXml/itemProps2.xml><?xml version="1.0" encoding="utf-8"?>
+<ds:datastoreItem xmlns:ds="http://schemas.openxmlformats.org/officeDocument/2006/customXml" ds:itemID="{57CF5DA3-0655-4356-8719-1751764BF27B}">
+  <ds:schemaRefs>
+    <ds:schemaRef ds:uri="http://schemas.openxmlformats.org/officeDocument/2006/bibliography"/>
+  </ds:schemaRefs>
+</ds:datastoreItem>
 </file>
 
-<file path=customXml/item4.xml><?xml version="1.0" encoding="utf-8"?>
-<b:Sources xmlns:b="http://schemas.openxmlformats.org/officeDocument/2006/bibliography" xmlns="http://schemas.openxmlformats.org/officeDocument/2006/bibliography" SelectedStyle="\APASixthEditionOfficeOnline.xsl" StyleName="APA" Version="6"/>
+<file path=customXml/itemProps3.xml><?xml version="1.0" encoding="utf-8"?>
+<ds:datastoreItem xmlns:ds="http://schemas.openxmlformats.org/officeDocument/2006/customXml" ds:itemID="{112498F8-0BC4-4C49-8845-33CB0D196A9F}">
+  <ds:schemaRefs>
+    <ds:schemaRef ds:uri="http://schemas.microsoft.com/sharepoint/v3/contenttype/forms"/>
+  </ds:schemaRefs>
+</ds:datastoreItem>
 </file>
 
-<file path=customXml/itemProps1.xml><?xml version="1.0" encoding="utf-8"?>
+<file path=customXml/itemProps4.xml><?xml version="1.0" encoding="utf-8"?>
 <ds:datastoreItem xmlns:ds="http://schemas.openxmlformats.org/officeDocument/2006/customXml" ds:itemID="{A7A01F20-6F4F-4CE0-B50D-C12479F62D14}">
   <ds:schemaRefs>
     <ds:schemaRef ds:uri="http://schemas.microsoft.com/office/2006/metadata/contentType"/>
@@ -24497,30 +24409,4 @@
     <ds:schemaRef ds:uri="http://schemas.microsoft.com/internal/obd"/>
   </ds:schemaRefs>
 </ds:datastoreItem>
-</file>
-
-<file path=customXml/itemProps2.xml><?xml version="1.0" encoding="utf-8"?>
-<ds:datastoreItem xmlns:ds="http://schemas.openxmlformats.org/officeDocument/2006/customXml" ds:itemID="{458F831A-0A64-4E61-9EE3-6D1D2F9B0B8D}">
-  <ds:schemaRefs>
-    <ds:schemaRef ds:uri="http://schemas.microsoft.com/office/2006/metadata/properties"/>
-    <ds:schemaRef ds:uri="http://schemas.microsoft.com/office/infopath/2007/PartnerControls"/>
-    <ds:schemaRef ds:uri="2f41cacf-ba40-4e80-92c4-0d83ba37ea51"/>
-  </ds:schemaRefs>
-</ds:datastoreItem>
-</file>
-
-<file path=customXml/itemProps3.xml><?xml version="1.0" encoding="utf-8"?>
-<ds:datastoreItem xmlns:ds="http://schemas.openxmlformats.org/officeDocument/2006/customXml" ds:itemID="{112498F8-0BC4-4C49-8845-33CB0D196A9F}">
-  <ds:schemaRefs>
-    <ds:schemaRef ds:uri="http://schemas.microsoft.com/sharepoint/v3/contenttype/forms"/>
-  </ds:schemaRefs>
-</ds:datastoreItem>
-</file>
-
-<file path=customXml/itemProps4.xml><?xml version="1.0" encoding="utf-8"?>
-<ds:datastoreItem xmlns:ds="http://schemas.openxmlformats.org/officeDocument/2006/customXml" ds:itemID="{57CF5DA3-0655-4356-8719-1751764BF27B}">
-  <ds:schemaRefs>
-    <ds:schemaRef ds:uri="http://schemas.openxmlformats.org/officeDocument/2006/bibliography"/>
-  </ds:schemaRefs>
-</ds:datastoreItem>
 </file>
</xml_diff>

<commit_message>
feat: Implement deep-dive redirect tracing for LotL SAML attacks, fix Opera GX extension size
</commit_message>
<xml_diff>
--- a/SentinURL.docx
+++ b/SentinURL.docx
@@ -1925,6 +1925,8 @@
       <w:r>
         <w:rPr>
           <w:rFonts w:ascii="Aptos" w:hAnsi="Aptos"/>
+          <w:b/>
+          <w:bCs/>
           <w:color w:val="FF0000"/>
         </w:rPr>
         <w:t>Term Frequency-Inverse Document Frequency (TF-IDF) Vectorizer paired with Logistic Regression</w:t>
@@ -3308,7 +3310,29 @@
         <w:rPr>
           <w:rFonts w:ascii="Aptos" w:hAnsi="Aptos"/>
         </w:rPr>
-        <w:t>The acquisition effort blended static academic datasets with dynamically sourced intelligence feeds to train both Stage 1 (LogReg) and Stage 2 (Histogram-based Gradient Boosting).</w:t>
+        <w:t xml:space="preserve">The acquisition effort blended static academic datasets with dynamically sourced intelligence feeds to train both </w:t>
+      </w:r>
+      <w:r>
+        <w:rPr>
+          <w:rFonts w:ascii="Aptos" w:hAnsi="Aptos"/>
+          <w:b/>
+          <w:bCs/>
+        </w:rPr>
+        <w:t>Stage 1 (LogReg)</w:t>
+      </w:r>
+      <w:r>
+        <w:rPr>
+          <w:rFonts w:ascii="Aptos" w:hAnsi="Aptos"/>
+        </w:rPr>
+        <w:t xml:space="preserve"> and </w:t>
+      </w:r>
+      <w:r>
+        <w:rPr>
+          <w:rFonts w:ascii="Aptos" w:hAnsi="Aptos"/>
+          <w:b/>
+          <w:bCs/>
+        </w:rPr>
+        <w:t>Stage 2 (Histogram-based Gradient Boosting).</w:t>
       </w:r>
       <w:r>
         <w:rPr>
@@ -3428,7 +3452,7 @@
         <w:rPr>
           <w:rFonts w:ascii="Aptos" w:hAnsi="Aptos"/>
         </w:rPr>
-        <w:t xml:space="preserve">In addition to aggregating global open-source threat intelligence, a substantial portion of the proprietary threat data utilized to train the machine learning models was acquired through an industry partnership with </w:t>
+        <w:t xml:space="preserve">In addition to aggregating global open-source threat intelligence, the training of the machine learning models was significantly bolstered by an industry partnership with </w:t>
       </w:r>
       <w:r>
         <w:rPr>
@@ -3450,13 +3474,13 @@
           <w:b/>
           <w:bCs/>
         </w:rPr>
-        <w:t xml:space="preserve">Bixah </w:t>
-      </w:r>
-      <w:r>
-        <w:rPr>
-          <w:rFonts w:ascii="Aptos" w:hAnsi="Aptos"/>
-        </w:rPr>
-        <w:t>generously provided localized, real-world cybersecurity telemetry which was instrumental in hardening the SentinURL detection engine against sophisticated, region-specific adversarial patterns that are frequently absent from public datasets.</w:t>
+        <w:t>Bixah</w:t>
+      </w:r>
+      <w:r>
+        <w:rPr>
+          <w:rFonts w:ascii="Aptos" w:hAnsi="Aptos"/>
+        </w:rPr>
+        <w:t xml:space="preserve"> provided specialized datasets consisting of localized, real-world malicious URLs. This proprietary link-data was instrumental in hardening the SentinURL detection engine against sophisticated, region-specific adversarial patterns that are often underrepresented in public datasets.</w:t>
       </w:r>
       <w:r>
         <w:br/>
@@ -3976,8 +4000,22 @@
       <w:r>
         <w:rPr>
           <w:rFonts w:ascii="Aptos" w:hAnsi="Aptos"/>
-        </w:rPr>
-        <w:t xml:space="preserve">Repositories: </w:t>
+          <w:b/>
+          <w:bCs/>
+        </w:rPr>
+        <w:t>Repositories</w:t>
+      </w:r>
+      <w:r>
+        <w:rPr>
+          <w:rFonts w:ascii="Aptos" w:hAnsi="Aptos"/>
+        </w:rPr>
+        <w:t>:</w:t>
+      </w:r>
+      <w:r>
+        <w:rPr>
+          <w:rFonts w:ascii="Aptos" w:hAnsi="Aptos"/>
+        </w:rPr>
+        <w:t xml:space="preserve"> </w:t>
       </w:r>
       <w:hyperlink r:id="rId23">
         <w:r>
@@ -5257,9 +5295,21 @@
         <w:rPr>
           <w:rFonts w:ascii="Aptos" w:hAnsi="Aptos"/>
         </w:rPr>
-        <w:t xml:space="preserve"> Distributions of URL Length &amp; Entropy (The "Deception Threshold")</w:t>
-      </w:r>
-      <w:r>
+        <w:t xml:space="preserve"> </w:t>
+      </w:r>
+      <w:r>
+        <w:rPr>
+          <w:rFonts w:ascii="Aptos" w:hAnsi="Aptos"/>
+          <w:b/>
+          <w:bCs/>
+        </w:rPr>
+        <w:t>Distributions of URL Length &amp; Entropy (The "Deception Threshold")</w:t>
+      </w:r>
+      <w:r>
+        <w:rPr>
+          <w:b/>
+          <w:bCs/>
+        </w:rPr>
         <w:br/>
       </w:r>
       <w:r>
@@ -5479,6 +5529,8 @@
       <w:r>
         <w:rPr>
           <w:rFonts w:ascii="Aptos" w:hAnsi="Aptos"/>
+          <w:b/>
+          <w:bCs/>
         </w:rPr>
         <w:t>Statistical Feature Selection &amp; Anomaly Correlation</w:t>
       </w:r>
@@ -5779,13 +5831,7 @@
           <w:b/>
           <w:bCs/>
         </w:rPr>
-        <w:t xml:space="preserve">: </w:t>
-      </w:r>
-      <w:r>
-        <w:rPr>
-          <w:rFonts w:ascii="Aptos" w:hAnsi="Aptos"/>
-        </w:rPr>
-        <w:t>The Threat Timeline (Domain Age Stratification)</w:t>
+        <w:t>: The Threat Timeline (Domain Age Stratification)</w:t>
       </w:r>
       <w:r>
         <w:br/>
@@ -6339,6 +6385,8 @@
         <w:jc w:val="both"/>
         <w:rPr>
           <w:rFonts w:ascii="Aptos" w:hAnsi="Aptos"/>
+          <w:b/>
+          <w:bCs/>
           <w:sz w:val="28"/>
           <w:szCs w:val="28"/>
         </w:rPr>
@@ -6351,14 +6399,56 @@
           <w:sz w:val="28"/>
           <w:szCs w:val="28"/>
         </w:rPr>
-        <w:t xml:space="preserve"> 2. Uniform URL Normalization (String Standardization)</w:t>
-      </w:r>
-      <w:r>
-        <w:rPr>
-          <w:rFonts w:ascii="Aptos" w:hAnsi="Aptos"/>
+        <w:t xml:space="preserve"> </w:t>
+      </w:r>
+    </w:p>
+    <w:p>
+      <w:pPr>
+        <w:rPr>
+          <w:rFonts w:ascii="Aptos" w:hAnsi="Aptos"/>
+          <w:b/>
+          <w:bCs/>
           <w:sz w:val="28"/>
           <w:szCs w:val="28"/>
         </w:rPr>
+      </w:pPr>
+      <w:r>
+        <w:rPr>
+          <w:rFonts w:ascii="Aptos" w:hAnsi="Aptos"/>
+          <w:b/>
+          <w:bCs/>
+          <w:sz w:val="28"/>
+          <w:szCs w:val="28"/>
+        </w:rPr>
+        <w:br w:type="page"/>
+      </w:r>
+    </w:p>
+    <w:p>
+      <w:pPr>
+        <w:jc w:val="both"/>
+        <w:rPr>
+          <w:rFonts w:ascii="Aptos" w:hAnsi="Aptos"/>
+          <w:sz w:val="28"/>
+          <w:szCs w:val="28"/>
+        </w:rPr>
+      </w:pPr>
+      <w:r>
+        <w:rPr>
+          <w:rFonts w:ascii="Aptos" w:hAnsi="Aptos"/>
+          <w:b/>
+          <w:bCs/>
+          <w:sz w:val="28"/>
+          <w:szCs w:val="28"/>
+        </w:rPr>
+        <w:lastRenderedPageBreak/>
+        <w:t>2. Uniform URL Normalization (String Standardization)</w:t>
+      </w:r>
+      <w:r>
+        <w:rPr>
+          <w:rFonts w:ascii="Aptos" w:hAnsi="Aptos"/>
+          <w:sz w:val="28"/>
+          <w:szCs w:val="28"/>
+        </w:rPr>
         <w:t xml:space="preserve"> </w:t>
       </w:r>
     </w:p>
@@ -6449,7 +6539,6 @@
           <w:b/>
           <w:bCs/>
         </w:rPr>
-        <w:lastRenderedPageBreak/>
         <w:t>- Case Folding:</w:t>
       </w:r>
       <w:r>
@@ -14639,18 +14728,26 @@
           <w:bCs/>
           <w:noProof/>
         </w:rPr>
-        <w:t xml:space="preserve">        </w:t>
-      </w:r>
-      <w:r>
-        <w:rPr>
-          <w:b/>
-          <w:bCs/>
-          <w:noProof/>
-        </w:rPr>
         <w:drawing>
-          <wp:inline distT="0" distB="0" distL="0" distR="0" wp14:anchorId="459E7855" wp14:editId="35EA42F1">
-            <wp:extent cx="4708971" cy="4465674"/>
+          <wp:anchor distT="0" distB="0" distL="114300" distR="114300" simplePos="0" relativeHeight="251660288" behindDoc="1" locked="0" layoutInCell="1" allowOverlap="1" wp14:anchorId="459E7855" wp14:editId="6782C13F">
+            <wp:simplePos x="0" y="0"/>
+            <wp:positionH relativeFrom="margin">
+              <wp:align>center</wp:align>
+            </wp:positionH>
+            <wp:positionV relativeFrom="paragraph">
+              <wp:posOffset>288468</wp:posOffset>
+            </wp:positionV>
+            <wp:extent cx="4708525" cy="4465320"/>
             <wp:effectExtent l="0" t="0" r="0" b="0"/>
+            <wp:wrapTight wrapText="bothSides">
+              <wp:wrapPolygon edited="0">
+                <wp:start x="0" y="0"/>
+                <wp:lineTo x="0" y="21471"/>
+                <wp:lineTo x="21498" y="21471"/>
+                <wp:lineTo x="21498" y="0"/>
+                <wp:lineTo x="0" y="0"/>
+              </wp:wrapPolygon>
+            </wp:wrapTight>
             <wp:docPr id="2025728868" name="Picture 4"/>
             <wp:cNvGraphicFramePr>
               <a:graphicFrameLocks xmlns:a="http://schemas.openxmlformats.org/drawingml/2006/main" noChangeAspect="1"/>
@@ -14677,7 +14774,7 @@
                   <pic:spPr>
                     <a:xfrm>
                       <a:off x="0" y="0"/>
-                      <a:ext cx="4717326" cy="4473597"/>
+                      <a:ext cx="4708525" cy="4465320"/>
                     </a:xfrm>
                     <a:prstGeom prst="rect">
                       <a:avLst/>
@@ -14686,8 +14783,38 @@
                 </pic:pic>
               </a:graphicData>
             </a:graphic>
-          </wp:inline>
+            <wp14:sizeRelH relativeFrom="page">
+              <wp14:pctWidth>0</wp14:pctWidth>
+            </wp14:sizeRelH>
+            <wp14:sizeRelV relativeFrom="page">
+              <wp14:pctHeight>0</wp14:pctHeight>
+            </wp14:sizeRelV>
+          </wp:anchor>
         </w:drawing>
+      </w:r>
+      <w:r>
+        <w:rPr>
+          <w:b/>
+          <w:bCs/>
+          <w:noProof/>
+        </w:rPr>
+        <w:t xml:space="preserve">     </w:t>
+      </w:r>
+      <w:r>
+        <w:rPr>
+          <w:b/>
+          <w:bCs/>
+          <w:noProof/>
+        </w:rPr>
+        <w:t xml:space="preserve">        </w:t>
+      </w:r>
+      <w:r>
+        <w:rPr>
+          <w:b/>
+          <w:bCs/>
+          <w:noProof/>
+        </w:rPr>
+        <w:t xml:space="preserve">   </w:t>
       </w:r>
     </w:p>
     <w:p>
@@ -24203,27 +24330,10 @@
 </file>
 
 <file path=customXml/item1.xml><?xml version="1.0" encoding="utf-8"?>
-<p:properties xmlns:p="http://schemas.microsoft.com/office/2006/metadata/properties" xmlns:xsi="http://www.w3.org/2001/XMLSchema-instance" xmlns:pc="http://schemas.microsoft.com/office/infopath/2007/PartnerControls">
-  <documentManagement>
-    <ReferenceId xmlns="2f41cacf-ba40-4e80-92c4-0d83ba37ea51" xsi:nil="true"/>
-  </documentManagement>
-</p:properties>
+<b:Sources xmlns:b="http://schemas.openxmlformats.org/officeDocument/2006/bibliography" xmlns="http://schemas.openxmlformats.org/officeDocument/2006/bibliography" SelectedStyle="\APASixthEditionOfficeOnline.xsl" StyleName="APA" Version="6"/>
 </file>
 
 <file path=customXml/item2.xml><?xml version="1.0" encoding="utf-8"?>
-<b:Sources xmlns:b="http://schemas.openxmlformats.org/officeDocument/2006/bibliography" xmlns="http://schemas.openxmlformats.org/officeDocument/2006/bibliography" SelectedStyle="\APASixthEditionOfficeOnline.xsl" StyleName="APA" Version="6"/>
-</file>
-
-<file path=customXml/item3.xml><?xml version="1.0" encoding="utf-8"?>
-<?mso-contentType ?>
-<FormTemplates xmlns="http://schemas.microsoft.com/sharepoint/v3/contenttype/forms">
-  <Display>DocumentLibraryForm</Display>
-  <Edit>DocumentLibraryForm</Edit>
-  <New>DocumentLibraryForm</New>
-</FormTemplates>
-</file>
-
-<file path=customXml/item4.xml><?xml version="1.0" encoding="utf-8"?>
 <ct:contentTypeSchema xmlns:ct="http://schemas.microsoft.com/office/2006/metadata/contentType" xmlns:ma="http://schemas.microsoft.com/office/2006/metadata/properties/metaAttributes" ct:_="" ma:_="" ma:contentTypeName="Document" ma:contentTypeID="0x010100C8027AB9FCF2A048BAA2B3190D159F70" ma:contentTypeVersion="4" ma:contentTypeDescription="Create a new document." ma:contentTypeScope="" ma:versionID="a3bbf791e9e695821cf694cadceaf317">
   <xsd:schema xmlns:xsd="http://www.w3.org/2001/XMLSchema" xmlns:xs="http://www.w3.org/2001/XMLSchema" xmlns:p="http://schemas.microsoft.com/office/2006/metadata/properties" xmlns:ns2="2f41cacf-ba40-4e80-92c4-0d83ba37ea51" targetNamespace="http://schemas.microsoft.com/office/2006/metadata/properties" ma:root="true" ma:fieldsID="fce7e238dc3040832873a454b433a91e" ns2:_="">
     <xsd:import namespace="2f41cacf-ba40-4e80-92c4-0d83ba37ea51"/>
@@ -24367,17 +24477,24 @@
 </ct:contentTypeSchema>
 </file>
 
-<file path=customXml/itemProps1.xml><?xml version="1.0" encoding="utf-8"?>
-<ds:datastoreItem xmlns:ds="http://schemas.openxmlformats.org/officeDocument/2006/customXml" ds:itemID="{458F831A-0A64-4E61-9EE3-6D1D2F9B0B8D}">
-  <ds:schemaRefs>
-    <ds:schemaRef ds:uri="http://schemas.microsoft.com/office/2006/metadata/properties"/>
-    <ds:schemaRef ds:uri="http://schemas.microsoft.com/office/infopath/2007/PartnerControls"/>
-    <ds:schemaRef ds:uri="2f41cacf-ba40-4e80-92c4-0d83ba37ea51"/>
-  </ds:schemaRefs>
-</ds:datastoreItem>
+<file path=customXml/item3.xml><?xml version="1.0" encoding="utf-8"?>
+<?mso-contentType ?>
+<FormTemplates xmlns="http://schemas.microsoft.com/sharepoint/v3/contenttype/forms">
+  <Display>DocumentLibraryForm</Display>
+  <Edit>DocumentLibraryForm</Edit>
+  <New>DocumentLibraryForm</New>
+</FormTemplates>
 </file>
 
-<file path=customXml/itemProps2.xml><?xml version="1.0" encoding="utf-8"?>
+<file path=customXml/item4.xml><?xml version="1.0" encoding="utf-8"?>
+<p:properties xmlns:p="http://schemas.microsoft.com/office/2006/metadata/properties" xmlns:xsi="http://www.w3.org/2001/XMLSchema-instance" xmlns:pc="http://schemas.microsoft.com/office/infopath/2007/PartnerControls">
+  <documentManagement>
+    <ReferenceId xmlns="2f41cacf-ba40-4e80-92c4-0d83ba37ea51" xsi:nil="true"/>
+  </documentManagement>
+</p:properties>
+</file>
+
+<file path=customXml/itemProps1.xml><?xml version="1.0" encoding="utf-8"?>
 <ds:datastoreItem xmlns:ds="http://schemas.openxmlformats.org/officeDocument/2006/customXml" ds:itemID="{57CF5DA3-0655-4356-8719-1751764BF27B}">
   <ds:schemaRefs>
     <ds:schemaRef ds:uri="http://schemas.openxmlformats.org/officeDocument/2006/bibliography"/>
@@ -24385,15 +24502,7 @@
 </ds:datastoreItem>
 </file>
 
-<file path=customXml/itemProps3.xml><?xml version="1.0" encoding="utf-8"?>
-<ds:datastoreItem xmlns:ds="http://schemas.openxmlformats.org/officeDocument/2006/customXml" ds:itemID="{112498F8-0BC4-4C49-8845-33CB0D196A9F}">
-  <ds:schemaRefs>
-    <ds:schemaRef ds:uri="http://schemas.microsoft.com/sharepoint/v3/contenttype/forms"/>
-  </ds:schemaRefs>
-</ds:datastoreItem>
-</file>
-
-<file path=customXml/itemProps4.xml><?xml version="1.0" encoding="utf-8"?>
+<file path=customXml/itemProps2.xml><?xml version="1.0" encoding="utf-8"?>
 <ds:datastoreItem xmlns:ds="http://schemas.openxmlformats.org/officeDocument/2006/customXml" ds:itemID="{A7A01F20-6F4F-4CE0-B50D-C12479F62D14}">
   <ds:schemaRefs>
     <ds:schemaRef ds:uri="http://schemas.microsoft.com/office/2006/metadata/contentType"/>
@@ -24409,4 +24518,22 @@
     <ds:schemaRef ds:uri="http://schemas.microsoft.com/internal/obd"/>
   </ds:schemaRefs>
 </ds:datastoreItem>
+</file>
+
+<file path=customXml/itemProps3.xml><?xml version="1.0" encoding="utf-8"?>
+<ds:datastoreItem xmlns:ds="http://schemas.openxmlformats.org/officeDocument/2006/customXml" ds:itemID="{112498F8-0BC4-4C49-8845-33CB0D196A9F}">
+  <ds:schemaRefs>
+    <ds:schemaRef ds:uri="http://schemas.microsoft.com/sharepoint/v3/contenttype/forms"/>
+  </ds:schemaRefs>
+</ds:datastoreItem>
+</file>
+
+<file path=customXml/itemProps4.xml><?xml version="1.0" encoding="utf-8"?>
+<ds:datastoreItem xmlns:ds="http://schemas.openxmlformats.org/officeDocument/2006/customXml" ds:itemID="{458F831A-0A64-4E61-9EE3-6D1D2F9B0B8D}">
+  <ds:schemaRefs>
+    <ds:schemaRef ds:uri="http://schemas.microsoft.com/office/2006/metadata/properties"/>
+    <ds:schemaRef ds:uri="http://schemas.microsoft.com/office/infopath/2007/PartnerControls"/>
+    <ds:schemaRef ds:uri="2f41cacf-ba40-4e80-92c4-0d83ba37ea51"/>
+  </ds:schemaRefs>
+</ds:datastoreItem>
 </file>
</xml_diff>